<commit_message>
style: refine all four conceptual diagrams to resolve text overlaps and export at 300 DPI, rebuild reports
</commit_message>
<xml_diff>
--- a/report_draft.docx
+++ b/report_draft.docx
@@ -149,7 +149,7 @@
       <w:r>
         <w:drawing>
           <wp:inline xmlns:a="http://schemas.openxmlformats.org/drawingml/2006/main" xmlns:pic="http://schemas.openxmlformats.org/drawingml/2006/picture">
-            <wp:extent cx="5303520" cy="2089265"/>
+            <wp:extent cx="5303520" cy="2140870"/>
             <wp:docPr id="1" name="Picture 1"/>
             <wp:cNvGraphicFramePr>
               <a:graphicFrameLocks noChangeAspect="1"/>
@@ -170,7 +170,7 @@
                   <pic:spPr>
                     <a:xfrm>
                       <a:off x="0" y="0"/>
-                      <a:ext cx="5303520" cy="2089265"/>
+                      <a:ext cx="5303520" cy="2140870"/>
                     </a:xfrm>
                     <a:prstGeom prst="rect"/>
                   </pic:spPr>
@@ -368,7 +368,7 @@
       <w:r>
         <w:drawing>
           <wp:inline xmlns:a="http://schemas.openxmlformats.org/drawingml/2006/main" xmlns:pic="http://schemas.openxmlformats.org/drawingml/2006/picture">
-            <wp:extent cx="4572000" cy="1751566"/>
+            <wp:extent cx="4572000" cy="1836728"/>
             <wp:docPr id="2" name="Picture 2"/>
             <wp:cNvGraphicFramePr>
               <a:graphicFrameLocks noChangeAspect="1"/>
@@ -389,7 +389,7 @@
                   <pic:spPr>
                     <a:xfrm>
                       <a:off x="0" y="0"/>
-                      <a:ext cx="4572000" cy="1751566"/>
+                      <a:ext cx="4572000" cy="1836728"/>
                     </a:xfrm>
                     <a:prstGeom prst="rect"/>
                   </pic:spPr>
@@ -444,7 +444,7 @@
       <w:r>
         <w:drawing>
           <wp:inline xmlns:a="http://schemas.openxmlformats.org/drawingml/2006/main" xmlns:pic="http://schemas.openxmlformats.org/drawingml/2006/picture">
-            <wp:extent cx="4114800" cy="3073078"/>
+            <wp:extent cx="4114800" cy="3075709"/>
             <wp:docPr id="3" name="Picture 3"/>
             <wp:cNvGraphicFramePr>
               <a:graphicFrameLocks noChangeAspect="1"/>
@@ -465,7 +465,7 @@
                   <pic:spPr>
                     <a:xfrm>
                       <a:off x="0" y="0"/>
-                      <a:ext cx="4114800" cy="3073078"/>
+                      <a:ext cx="4114800" cy="3075709"/>
                     </a:xfrm>
                     <a:prstGeom prst="rect"/>
                   </pic:spPr>
@@ -541,7 +541,7 @@
       <w:r>
         <w:drawing>
           <wp:inline xmlns:a="http://schemas.openxmlformats.org/drawingml/2006/main" xmlns:pic="http://schemas.openxmlformats.org/drawingml/2006/picture">
-            <wp:extent cx="3840480" cy="3274655"/>
+            <wp:extent cx="3840480" cy="3577710"/>
             <wp:docPr id="4" name="Picture 4"/>
             <wp:cNvGraphicFramePr>
               <a:graphicFrameLocks noChangeAspect="1"/>
@@ -562,7 +562,7 @@
                   <pic:spPr>
                     <a:xfrm>
                       <a:off x="0" y="0"/>
-                      <a:ext cx="3840480" cy="3274655"/>
+                      <a:ext cx="3840480" cy="3577710"/>
                     </a:xfrm>
                     <a:prstGeom prst="rect"/>
                   </pic:spPr>

</xml_diff>

<commit_message>
style: replace hand-drawn Matplotlib layouts with professional Mermaid vector-rendered diagrams via Kroki API, rebuild reports
</commit_message>
<xml_diff>
--- a/report_draft.docx
+++ b/report_draft.docx
@@ -149,7 +149,7 @@
       <w:r>
         <w:drawing>
           <wp:inline xmlns:a="http://schemas.openxmlformats.org/drawingml/2006/main" xmlns:pic="http://schemas.openxmlformats.org/drawingml/2006/picture">
-            <wp:extent cx="5303520" cy="2140870"/>
+            <wp:extent cx="5303520" cy="1434635"/>
             <wp:docPr id="1" name="Picture 1"/>
             <wp:cNvGraphicFramePr>
               <a:graphicFrameLocks noChangeAspect="1"/>
@@ -170,7 +170,7 @@
                   <pic:spPr>
                     <a:xfrm>
                       <a:off x="0" y="0"/>
-                      <a:ext cx="5303520" cy="2140870"/>
+                      <a:ext cx="5303520" cy="1434635"/>
                     </a:xfrm>
                     <a:prstGeom prst="rect"/>
                   </pic:spPr>
@@ -444,7 +444,7 @@
       <w:r>
         <w:drawing>
           <wp:inline xmlns:a="http://schemas.openxmlformats.org/drawingml/2006/main" xmlns:pic="http://schemas.openxmlformats.org/drawingml/2006/picture">
-            <wp:extent cx="4114800" cy="3075709"/>
+            <wp:extent cx="4114800" cy="1221900"/>
             <wp:docPr id="3" name="Picture 3"/>
             <wp:cNvGraphicFramePr>
               <a:graphicFrameLocks noChangeAspect="1"/>
@@ -465,7 +465,7 @@
                   <pic:spPr>
                     <a:xfrm>
                       <a:off x="0" y="0"/>
-                      <a:ext cx="4114800" cy="3075709"/>
+                      <a:ext cx="4114800" cy="1221900"/>
                     </a:xfrm>
                     <a:prstGeom prst="rect"/>
                   </pic:spPr>

</xml_diff>

<commit_message>
style: fix paragraph spacing, clean manual newlines causing layout breaks, and replace inline LaTeX with clean Unicode symbols
</commit_message>
<xml_diff>
--- a/report_draft.docx
+++ b/report_draft.docx
@@ -4,7 +4,7 @@
   <w:body>
     <w:p>
       <w:pPr>
-        <w:spacing w:before="0" w:after="360" w:line="276" w:lineRule="auto"/>
+        <w:spacing w:after="360"/>
         <w:jc w:val="center"/>
       </w:pPr>
       <w:r>
@@ -19,7 +19,7 @@
     </w:p>
     <w:p>
       <w:pPr>
-        <w:spacing w:before="0" w:after="480" w:line="276" w:lineRule="auto"/>
+        <w:spacing w:after="480"/>
         <w:jc w:val="center"/>
       </w:pPr>
       <w:r>
@@ -61,7 +61,7 @@
     </w:p>
     <w:p>
       <w:pPr>
-        <w:spacing w:before="0" w:after="360" w:line="276" w:lineRule="auto"/>
+        <w:spacing w:after="360"/>
         <w:jc w:val="both"/>
       </w:pPr>
       <w:r>
@@ -95,7 +95,7 @@
         <w:jc w:val="both"/>
       </w:pPr>
       <w:r>
-        <w:t>Diabetic Retinopathy (DR) is a microvascular complication of diabetes mellitus that leads to progressive, irreversible vision impairment if left diagnosed. India currently bears a substantial share of the global diabetic burden, with over 101 million diagnosed individuals and another 136 million classified as pre-diabetic. The clinical screening pipeline is severely bottlenecked: the ratio of ophthalmologists to the population in rural India is critically low, leaving over 50-70% of diabetic patients unscreened until advanced visual deficit occurs. Deep learning architectures, particularly Convolutional Neural Networks (CNNs), have demonstrated near-human classification accuracy in grading DR severity from color fundus photographs. However, training these models requires aggregating hundreds of thousands of high-resolution clinical images from diverse demographic populations to generalize across variations in fundus camera optics, lighting conditions, and clinical cohorts.</w:t>
+        <w:t>Diabetic Retinopathy (DR) is a microvascular complication of diabetes mellitus that leads to progressive, irreversible vision impairment if left diagnosed. India currently bears a substantial share of the global diabetic burden, with over 101 million diagnosed individuals and another 136 million classified as pre-diabetic. The clinical screening pipeline is severely bottlenecked: the ratio of ophthalmologists to the population in rural India is critically low, leaving over 50-70% of diabetic patients unscreened until advanced visual deficit occurs. Deep learning architectures, particularly Convolutional Neural Networks (CNNs), have demonstrated near-human classification accuracy in grading DR severity from color fundus photographs. Training these models requires aggregating hundreds of thousands of high-resolution clinical images from diverse demographic populations to generalize across variations in fundus camera optics, lighting conditions, and clinical cohorts.</w:t>
       </w:r>
     </w:p>
     <w:p>
@@ -122,28 +122,12 @@
         <w:jc w:val="both"/>
       </w:pPr>
       <w:r>
-        <w:t xml:space="preserve">To mitigate client drift under non-IID conditions, regularized frameworks like FedProx introduce a proximal regularization </w:t>
-        <w:br/>
-        <w:t xml:space="preserve">penalty (parameter \mu) that limits the deviation of local updates from the global model state. However, the exact operational </w:t>
-        <w:br/>
-        <w:t xml:space="preserve">boundaries under which proximal regularization helps or hurts global convergence and local client equity remain poorly </w:t>
-        <w:br/>
-        <w:t xml:space="preserve">characterized in clinical settings. This study addresses this gap by executing a rigorous hyperparameter sweep across Dirichlet </w:t>
-        <w:br/>
-        <w:t xml:space="preserve">concentration parameters (\alpha \in \{0.05, 0.1, 0.3, 1.0\}) and regularization weights (\mu \in \{0.0, 0.01, 0.1, 1.0\}). </w:t>
-        <w:br/>
-        <w:t xml:space="preserve">Furthermore, we analyze the performance of a third algorithm, SCAFFOLD, which utilizes control variates to correct client-drift, </w:t>
-        <w:br/>
-        <w:t xml:space="preserve">detailing an implementation bug in the control variates that was successfully resolved during our verification sweep. </w:t>
-        <w:br/>
-        <w:t xml:space="preserve">Finally, we analyze the statistical power limits of small clinical cohorts, demonstrating the mathematical necessity of </w:t>
-        <w:br/>
-        <w:t>multi-silo pipeline scaling via a combined 4,075-image training set.</w:t>
+        <w:t>To mitigate client drift under non-IID conditions, regularized frameworks like FedProx introduce a proximal regularization penalty (parameter μ) that limits the deviation of local updates from the global model state. However, the exact operational boundaries under which proximal regularization helps or hurts global convergence and local client equity remain poorly characterized in clinical settings. This study addresses this gap by executing a rigorous hyperparameter sweep across Dirichlet concentration parameters (α ∈ {0.05, 0.1, 0.3, 1.0}) and regularization weights (μ ∈ {0.0, 0.01, 0.1, 1.0}). Furthermore, we analyze the performance of a third algorithm, SCAFFOLD, which utilizes control variates to correct client-drift, detailing an implementation bug in the control variates that was successfully resolved during our verification sweep. Finally, we analyze the statistical power limits of small clinical cohorts, demonstrating the mathematical necessity of multi-silo pipeline scaling via a combined 4,075-image training set.</w:t>
       </w:r>
     </w:p>
     <w:p>
       <w:pPr>
-        <w:spacing w:before="240" w:after="120" w:line="276" w:lineRule="auto"/>
+        <w:spacing w:before="240" w:after="80"/>
         <w:jc w:val="center"/>
       </w:pPr>
       <w:r>
@@ -232,19 +216,7 @@
         <w:jc w:val="both"/>
       </w:pPr>
       <w:r>
-        <w:t xml:space="preserve">To stabilize decentralized training, optimization variants have modified the local loss function. The foundational algorithm, </w:t>
-        <w:br/>
-        <w:t xml:space="preserve">Federated Averaging (FedAvg) [1], performs local gradient updates and aggregates parameters at the server. FedProx [2] restricts </w:t>
-        <w:br/>
-        <w:t xml:space="preserve">local client drift by adding an L_2 proximal term, penalizing updates that deviate from the global model. In parallel, </w:t>
-        <w:br/>
-        <w:t xml:space="preserve">variance-reduction methods like SCAFFOLD [3] introduce global and client control variates to dynamically correct the gradient </w:t>
-        <w:br/>
-        <w:t xml:space="preserve">update directions. Empirical surveys of federated optimization [5] show that while regularization is highly effective under </w:t>
-        <w:br/>
-        <w:t xml:space="preserve">moderate heterogeneity, its performance degrades under severe non-IID conditions, emphasizing the need to characterize </w:t>
-        <w:br/>
-        <w:t>regularization thresholds.</w:t>
+        <w:t>To stabilize decentralized training, optimization variants have modified the local loss function. The foundational algorithm, Federated Averaging (FedAvg) [1], performs local gradient updates and aggregates parameters at the server. FedProx [2] restricts local client drift by adding an L₂ proximal term, penalizing updates that deviate from the global model. In parallel, variance-reduction methods like SCAFFOLD [3] introduce global and client control variates to dynamically correct the gradient update directions. Empirical surveys of federated optimization [5] show that while regularization is highly effective under moderate heterogeneity, its performance degrades under severe non-IID conditions, emphasizing the need to characterize regularization thresholds.</w:t>
       </w:r>
     </w:p>
     <w:p>
@@ -253,17 +225,7 @@
         <w:jc w:val="both"/>
       </w:pPr>
       <w:r>
-        <w:t xml:space="preserve">Simulating clinical heterogeneity is typically achieved using Dirichlet distribution partitioning. First popularized by Hsu et al. </w:t>
-        <w:br/>
-        <w:t xml:space="preserve">[4], class-wise Dirichlet sampling allocates class indices to simulated client nodes using a concentration parameter \alpha. </w:t>
-        <w:br/>
-        <w:t xml:space="preserve">Under small concentration parameters (e.g., \alpha &lt; 0.1), the partitioner models severe, realistic diagnostic skew where </w:t>
-        <w:br/>
-        <w:t xml:space="preserve">individual clinics lack entire categories of disease. Lightweight benchmarks like RetinaMNIST (from MedMNIST v2) [6] provide </w:t>
-        <w:br/>
-        <w:t xml:space="preserve">a standardized, computationally tractable platform to run extensive hyperparameter grids, allowing researchers to isolate </w:t>
-        <w:br/>
-        <w:t>the impacts of class skew and regularization without the confounding effects of extremely high-resolution image processing.</w:t>
+        <w:t>Simulating clinical heterogeneity is typically achieved using Dirichlet distribution partitioning. First popularized by Hsu et al. [4], class-wise Dirichlet sampling allocates class indices to simulated client nodes using a concentration parameter α. Under small concentration parameters (e.g., α &lt; 0.1), the partitioner models severe, realistic diagnostic skew where individual clinics lack entire categories of disease. Lightweight benchmarks like RetinaMNIST (from MedMNIST v2) [6] provide a standardized, computationally tractable platform to run extensive hyperparameter grids, allowing researchers to isolate the impacts of class skew and regularization without the confounding effects of extremely high-resolution image processing.</w:t>
       </w:r>
     </w:p>
     <w:p>
@@ -302,21 +264,7 @@
         <w:jc w:val="both"/>
       </w:pPr>
       <w:r>
-        <w:t xml:space="preserve">To classify the 5 grades of Diabetic Retinopathy (DR) on the 28x28 pixel images of the RetinaMNIST dataset, we design </w:t>
-        <w:br/>
-        <w:t xml:space="preserve">RetinaCNN, a customized 3-layer Convolutional Neural Network. RetinaCNN comprises three sequential Conv2d blocks. Block 1 utilizes </w:t>
-        <w:br/>
-        <w:t xml:space="preserve">16 output filters (3\times3 kernel, stride=1, padding=1) followed by BatchNorm2d, a ReLU activation, and MaxPool2d (stride=2), </w:t>
-        <w:br/>
-        <w:t xml:space="preserve">reducing spatial dimensions to 14x14. Block 2 scales channel width to 32 filters, outputting 7x7 spatial maps. Block 3 utilizes </w:t>
-        <w:br/>
-        <w:t xml:space="preserve">64 filters, yielding 3x3 maps. The classifier head flattens the 576-dimensional feature representation and routes it through a </w:t>
-        <w:br/>
-        <w:t xml:space="preserve">Linear layer (128 units), a ReLU activation, a Dropout layer (p=0.3), and a final Linear projection layer to output 5 logits </w:t>
-        <w:br/>
-        <w:t xml:space="preserve">corresponding to the 5 DR severity grades. The total trainable parameter count is exactly 98,309 (as verified via structural </w:t>
-        <w:br/>
-        <w:t>numel queries), ensuring rapid convergence and preventing overfitting on small client silos.</w:t>
+        <w:t>To classify the 5 grades of Diabetic Retinopathy (DR) on the 28x28 pixel images of the RetinaMNIST dataset, we design RetinaCNN, a customized 3-layer Convolutional Neural Network. RetinaCNN comprises three sequential Conv2d blocks. Block 1 utilizes 16 output filters (3×3 kernel, stride=1, padding=1) followed by BatchNorm2d, a ReLU activation, and MaxPool2d (stride=2), reducing spatial dimensions to 14x14. Block 2 scales channel width to 32 filters, outputting 7x7 spatial maps. Block 3 utilizes 64 filters, yielding 3x3 maps. The classifier head flattens the 576-dimensional feature representation and routes it through a Linear layer (128 units), a ReLU activation, a Dropout layer (p=0.3), and a final Linear projection layer to output 5 logits corresponding to the 5 DR severity grades. The total trainable parameter count is exactly 98,309 (as verified via structural numel queries), ensuring rapid convergence and preventing overfitting on small client silos.</w:t>
       </w:r>
     </w:p>
     <w:p>
@@ -325,7 +273,7 @@
         <w:jc w:val="both"/>
       </w:pPr>
       <w:r>
-        <w:t>For clinical grading on the high-resolution Indian Diabetic Retinopathy Image Dataset (IDRiD) from Vijayanagar Institute of Medical Sciences, Karnataka, we employ a pre-trained EfficientNet-B0 backbone (5.3M parameters) via the `timm` library. The model is pretrained on ImageNet, and the final classification layer is replaced with a 5-unit Linear classifier. Retinal fundus photographs are dynamically resized to 224x224 pixels, normalized, and augmented with random cropping, horizontal flipping, rotation, and ColorJitter (brightness and contrast) to simulate clinical imaging variations.</w:t>
+        <w:t>For clinical grading on the high-resolution Indian Diabetic Retinopathy Image Dataset (IDRiD) from Vijayanagar Institute of Medical Sciences, Karnataka, we employ a pre-trained EfficientNet-B0 backbone (5.3M parameters) via the timm library. The model is pretrained on ImageNet, and the final classification layer is replaced with a 5-unit Linear classifier. Retinal fundus photographs are dynamically resized to 224x224 pixels, normalized, and augmented with random cropping, horizontal flipping, rotation, and ColorJitter (brightness and contrast) to simulate clinical imaging variations.</w:t>
       </w:r>
     </w:p>
     <w:p>
@@ -349,20 +297,12 @@
         <w:jc w:val="both"/>
       </w:pPr>
       <w:r>
-        <w:t xml:space="preserve">To simulate clinical data partitions across K hospital nodes, we employ class-wise Dirichlet partitioning [4]. For each </w:t>
-        <w:br/>
-        <w:t xml:space="preserve">DR grade class c \in \{0, 1, 2, 3, 4\}, we sample a partition vector q_c \sim \text{Dirichlet}(\alpha \cdot \mathbf{1}_K) </w:t>
-        <w:br/>
-        <w:t xml:space="preserve">where \alpha is the concentration parameter. The client allocation index distributes samples such that lower \alpha values </w:t>
-        <w:br/>
-        <w:t xml:space="preserve">(e.g., \alpha = 0.05) result in severe class exclusion across clients. In this study, we swept \alpha \in \{0.05, 0.1, 0.3, 1.0\} </w:t>
-        <w:br/>
-        <w:t>to cover regimes from extreme clinical skew (where clients only have 1 or 2 classes) to homogeneous class structures (near-IID).</w:t>
+        <w:t>To simulate clinical data partitions across K hospital nodes, we employ class-wise Dirichlet partitioning [4]. For each DR grade class c ∈ {0, 1, 2, 3, 4}, we sample a partition vector q_c ~ Dirichlet(α · 1_K) where α is the concentration parameter. The client allocation index distributes samples such that lower α values (e.g., α = 0.05) result in severe class exclusion across clients. In this study, we swept α ∈ {0.05, 0.1, 0.3, 1.0} to cover regimes from extreme clinical skew (where clients only have 1 or 2 classes) to homogeneous class structures (near-IID).</w:t>
       </w:r>
     </w:p>
     <w:p>
       <w:pPr>
-        <w:spacing w:before="240" w:after="120" w:line="276" w:lineRule="auto"/>
+        <w:spacing w:before="240" w:after="80"/>
         <w:jc w:val="center"/>
       </w:pPr>
       <w:r>
@@ -433,12 +373,12 @@
         <w:jc w:val="both"/>
       </w:pPr>
       <w:r>
-        <w:t>The federated system is implemented as a manual, single-process Python training loop. This implementation design was chosen intentionally to circumvent the VRAM overhead and runtime instability of distributed frameworks (such as Flower, Ray, or Docker) on compute-constrained workstations. The simulation ran on a local Ubuntu workstation equipped with an Intel Core i7-13700 CPU and an NVIDIA RTX A2000 12GB VRAM GPU. The local training loops utilize PyTorch's native Cuda structures. Parallel data loading is implemented using `DataLoader` with `num_workers=4` and `pin_memory=True` to eliminate disk I/O bottlenecks. Figure 3 visually maps this client-server topology, highlighting the privacy constraints.</w:t>
+        <w:t>The federated system is implemented as a manual, single-process Python training loop. This implementation design was chosen intentionally to circumvent the VRAM overhead and runtime instability of distributed frameworks (such as Flower, Ray, or Docker) on compute-constrained workstations. The simulation ran on a local Ubuntu workstation equipped with an Intel Core i7-13700 CPU and an NVIDIA RTX A2000 12GB VRAM GPU. The local training loops utilize PyTorch's native Cuda structures. Parallel data loading is implemented using DataLoader with num_workers=4 and pin_memory=True to eliminate disk I/O bottlenecks. Figure 3 visually maps this client-server topology, highlighting the privacy constraints.</w:t>
       </w:r>
     </w:p>
     <w:p>
       <w:pPr>
-        <w:spacing w:before="240" w:after="120" w:line="276" w:lineRule="auto"/>
+        <w:spacing w:before="240" w:after="80"/>
         <w:jc w:val="center"/>
       </w:pPr>
       <w:r>
@@ -505,37 +445,73 @@
     </w:p>
     <w:p>
       <w:pPr>
-        <w:spacing w:before="0" w:after="120" w:line="276" w:lineRule="auto"/>
+        <w:spacing w:before="0" w:after="40" w:line="276" w:lineRule="auto"/>
         <w:jc w:val="both"/>
       </w:pPr>
       <w:r>
-        <w:t xml:space="preserve">The baseline Federated Averaging (FedAvg) aggregates parameters by computing a weighted average: </w:t>
-        <w:br/>
-        <w:t xml:space="preserve">w^{t+1} = \sum_{k=1}^K \frac{n_k}{N} w_k^{t+1} </w:t>
-        <w:br/>
-        <w:t>where w_k^{t+1} represents local weights updated over E epochs using standard Cross-Entropy Loss.</w:t>
+        <w:t>The baseline Federated Averaging (FedAvg) aggregates parameters by computing a sample-size weighted average:</w:t>
       </w:r>
     </w:p>
     <w:p>
       <w:pPr>
-        <w:spacing w:before="0" w:after="120" w:line="276" w:lineRule="auto"/>
-        <w:jc w:val="both"/>
+        <w:keepNext/>
+        <w:spacing w:before="160" w:after="160"/>
+        <w:jc w:val="center"/>
       </w:pPr>
       <w:r>
-        <w:t xml:space="preserve">The Federated Proximal (FedProx) algorithm [2] modifies the local objective function by adding an L_2 regularization penalty </w:t>
-        <w:br/>
-        <w:t xml:space="preserve">to restrict parameter drift: </w:t>
-        <w:br/>
-        <w:t xml:space="preserve">L_k(w; w^t) = F_k(w) + \frac{\mu}{2} \| w - w^t \|^2_2 </w:t>
-        <w:br/>
-        <w:t xml:space="preserve">where w^t is the broadcast global model parameter set at round t, and \mu is the regularization multiplier. The parameter </w:t>
-        <w:br/>
-        <w:t>difference term acts as a trust region constraint.</w:t>
+        <w:rPr>
+          <w:rFonts w:ascii="Times New Roman" w:hAnsi="Times New Roman"/>
+          <w:i/>
+          <w:sz w:val="22"/>
+        </w:rPr>
+        <w:t>wᵗ⁺¹ = ∑_{k=1}^K (n_k / N) · w_k^(t+1)</w:t>
       </w:r>
     </w:p>
     <w:p>
       <w:pPr>
-        <w:spacing w:before="240" w:after="120" w:line="276" w:lineRule="auto"/>
+        <w:spacing w:before="40" w:after="120" w:line="276" w:lineRule="auto"/>
+        <w:jc w:val="both"/>
+      </w:pPr>
+      <w:r>
+        <w:t>where w_k^(t+1) represents local weight parameters updated over E epochs at client k using standard Cross-Entropy Loss.</w:t>
+      </w:r>
+    </w:p>
+    <w:p>
+      <w:pPr>
+        <w:spacing w:before="0" w:after="40" w:line="276" w:lineRule="auto"/>
+        <w:jc w:val="both"/>
+      </w:pPr>
+      <w:r>
+        <w:t>The Federated Proximal (FedProx) algorithm [2] modifies the local objective function by adding an L₂ regularization penalty to restrict local parameter drift:</w:t>
+      </w:r>
+    </w:p>
+    <w:p>
+      <w:pPr>
+        <w:keepNext/>
+        <w:spacing w:before="160" w:after="160"/>
+        <w:jc w:val="center"/>
+      </w:pPr>
+      <w:r>
+        <w:rPr>
+          <w:rFonts w:ascii="Times New Roman" w:hAnsi="Times New Roman"/>
+          <w:i/>
+          <w:sz w:val="22"/>
+        </w:rPr>
+        <w:t>L_k(w; wᵗ) = F_k(w) + (μ / 2) · ‖w - wᵗ‖₂²</w:t>
+      </w:r>
+    </w:p>
+    <w:p>
+      <w:pPr>
+        <w:spacing w:before="40" w:after="120" w:line="276" w:lineRule="auto"/>
+        <w:jc w:val="both"/>
+      </w:pPr>
+      <w:r>
+        <w:t>where wᵗ is the broadcast global model parameter set at round t, and μ is the regularization multiplier. The parameter difference term acts as a trust region constraint.</w:t>
+      </w:r>
+    </w:p>
+    <w:p>
+      <w:pPr>
+        <w:spacing w:before="240" w:after="80"/>
         <w:jc w:val="center"/>
       </w:pPr>
       <w:r>
@@ -587,25 +563,74 @@
     </w:p>
     <w:p>
       <w:pPr>
-        <w:spacing w:before="0" w:after="120" w:line="276" w:lineRule="auto"/>
+        <w:spacing w:before="0" w:after="40" w:line="276" w:lineRule="auto"/>
         <w:jc w:val="both"/>
       </w:pPr>
       <w:r>
-        <w:t xml:space="preserve">For SCAFFOLD [3], the client updates are corrected using control variates. The local gradient step is adjusted by the difference </w:t>
-        <w:br/>
-        <w:t xml:space="preserve">between the global control variate c and the client control variate c_k: </w:t>
-        <w:br/>
-        <w:t xml:space="preserve">g_k(w) = \nabla F_k(w) + (c - c_k) </w:t>
-        <w:br/>
-        <w:t xml:space="preserve">At the end of local training, the client control variate is updated. To avoid momentum mismatch under adaptive optimizers or SGD </w:t>
-        <w:br/>
-        <w:t xml:space="preserve">momentum, we implement the gradient-accumulation Option II variant of SCAFFOLD, where c_k^+ is computed directly from the average </w:t>
-        <w:br/>
-        <w:t xml:space="preserve">uncorrected local gradients accumulated over the step: </w:t>
-        <w:br/>
-        <w:t xml:space="preserve">c_k^+ \leftarrow \frac{1}{K_{steps}} \sum_{s=1}^{K_{steps}} g_{raw}(y_s) </w:t>
-        <w:br/>
-        <w:t>and the global control variate updates as the average change: c \leftarrow c + \frac{1}{N_{clients}} \sum (c_k^+ - c_k).</w:t>
+        <w:t>For SCAFFOLD [3], the client updates are corrected using control variates. The local gradient step is adjusted by the difference between the global control variate c and the client control variate c_k:</w:t>
+      </w:r>
+    </w:p>
+    <w:p>
+      <w:pPr>
+        <w:keepNext/>
+        <w:spacing w:before="160" w:after="160"/>
+        <w:jc w:val="center"/>
+      </w:pPr>
+      <w:r>
+        <w:rPr>
+          <w:rFonts w:ascii="Times New Roman" w:hAnsi="Times New Roman"/>
+          <w:i/>
+          <w:sz w:val="22"/>
+        </w:rPr>
+        <w:t>g_k(w) = ∇F_k(w) + (c - c_k)</w:t>
+      </w:r>
+    </w:p>
+    <w:p>
+      <w:pPr>
+        <w:spacing w:before="40" w:after="40" w:line="276" w:lineRule="auto"/>
+        <w:jc w:val="both"/>
+      </w:pPr>
+      <w:r>
+        <w:t>At the end of local training, the client control variate is updated. To avoid momentum mismatch under adaptive optimizers or SGD momentum, we implement the gradient-accumulation Option II variant of SCAFFOLD, where c_k⁺ is computed directly from the average uncorrected local gradients accumulated over the step:</w:t>
+      </w:r>
+    </w:p>
+    <w:p>
+      <w:pPr>
+        <w:keepNext/>
+        <w:spacing w:before="160" w:after="160"/>
+        <w:jc w:val="center"/>
+      </w:pPr>
+      <w:r>
+        <w:rPr>
+          <w:rFonts w:ascii="Times New Roman" w:hAnsi="Times New Roman"/>
+          <w:i/>
+          <w:sz w:val="22"/>
+        </w:rPr>
+        <w:t>c_k⁺ ← (1 / K_steps) · ∑_{s=1}^{K_steps} g_raw(y_s)</w:t>
+      </w:r>
+    </w:p>
+    <w:p>
+      <w:pPr>
+        <w:spacing w:before="40" w:after="40" w:line="276" w:lineRule="auto"/>
+        <w:jc w:val="both"/>
+      </w:pPr>
+      <w:r>
+        <w:t>and the global control variate updates as the average change:</w:t>
+      </w:r>
+    </w:p>
+    <w:p>
+      <w:pPr>
+        <w:keepNext/>
+        <w:spacing w:before="160" w:after="160"/>
+        <w:jc w:val="center"/>
+      </w:pPr>
+      <w:r>
+        <w:rPr>
+          <w:rFonts w:ascii="Times New Roman" w:hAnsi="Times New Roman"/>
+          <w:i/>
+          <w:sz w:val="22"/>
+        </w:rPr>
+        <w:t>c ← c + (1 / N_clients) · ∑ (c_k⁺ - c_k)</w:t>
       </w:r>
     </w:p>
     <w:p>
@@ -644,19 +669,7 @@
         <w:jc w:val="both"/>
       </w:pPr>
       <w:r>
-        <w:t xml:space="preserve">To establish a clinical diagnostic upper bound, we trained a centralized model on the full 413-image IDRiD training set </w:t>
-        <w:br/>
-        <w:t xml:space="preserve">using locked hyperparameters: AdamW (learning rate \eta=1e-4, weight decay =1e-2), CosineAnnealingLR (T_{max}=25), and </w:t>
-        <w:br/>
-        <w:t xml:space="preserve">data augmentations. The centralized baseline achieved a global test accuracy of **55.34%** at epoch 4. </w:t>
-        <w:br/>
-        <w:t xml:space="preserve">Table 1 outlines the hyperparameters and training outcomes. In a federated setup under extreme non-IID conditions (\alpha=0.3), </w:t>
-        <w:br/>
-        <w:t xml:space="preserve">a single local client training independently on its own partition (Client 0, 301 samples) and evaluated on the global test set </w:t>
-        <w:br/>
-        <w:t xml:space="preserve">reaches a peak accuracy of only **42.72%** (at epoch 19). The confusion matrix for this local model (Table 1) demonstrates </w:t>
-        <w:br/>
-        <w:t>severe misclassification bias, primarily over-predicting the majority class due to local class imbalances.</w:t>
+        <w:t>To establish a clinical diagnostic upper bound, we trained a centralized model on the full 413-image IDRiD training set using locked hyperparameters: AdamW (learning rate η=1e-4, weight decay =1e-2), CosineAnnealingLR (T_max=25), and data augmentations. The centralized baseline achieved a global test accuracy of 55.34% at epoch 4. Table 1 outlines the hyperparameters and training outcomes. In a federated setup under extreme non-IID conditions (α=0.3), a single local client training independently on its own partition (Client 0, 301 samples) and evaluated on the global test set reaches a peak accuracy of only 42.72% (at epoch 19). The confusion matrix for this local model (Table 1) demonstrates severe misclassification bias, primarily over-predicting the majority class due to local class imbalances.</w:t>
       </w:r>
     </w:p>
     <w:tbl>
@@ -1071,7 +1084,6 @@
     </w:p>
     <w:p>
       <w:pPr>
-        <w:spacing w:before="0" w:after="120" w:line="276" w:lineRule="auto"/>
         <w:jc w:val="center"/>
       </w:pPr>
       <w:r>
@@ -1863,7 +1875,7 @@
     </w:p>
     <w:p>
       <w:pPr>
-        <w:spacing w:before="240" w:after="120" w:line="276" w:lineRule="auto"/>
+        <w:spacing w:before="240" w:after="80"/>
         <w:jc w:val="center"/>
       </w:pPr>
       <w:r>
@@ -1934,21 +1946,7 @@
         <w:jc w:val="both"/>
       </w:pPr>
       <w:r>
-        <w:t xml:space="preserve">The controlled hyperparameter sweep on the RetinaMNIST benchmark maps the performance boundaries across varying </w:t>
-        <w:br/>
-        <w:t xml:space="preserve">Dirichlet data distributions. Table 2 compiles the final test accuracy and best round-to-round peak accuracy (averaged </w:t>
-        <w:br/>
-        <w:t xml:space="preserve">across seeds 42, 123, and 777) for FedAvg, FedProx (with \mu \in \{0.01, 0.1, 1.0\}), and the corrected SCAFFOLD algorithm. </w:t>
-        <w:br/>
-        <w:t xml:space="preserve">Under extreme statistical skew (\alpha=0.05 and 0.1), the proximal penalty acts as an artificial barrier that restricts </w:t>
-        <w:br/>
-        <w:t xml:space="preserve">local adaptation, resulting in a performance drop. For instance, under \alpha=0.1, FedProx with \mu=1.0 degrades the final </w:t>
-        <w:br/>
-        <w:t xml:space="preserve">accuracy from 43.50% (FedAvg) to 41.00%. However, under moderate to low heterogeneity (\alpha=0.3 and 1.0), the proximal </w:t>
-        <w:br/>
-        <w:t xml:space="preserve">constraint successfully stabilizes training and restricts client drift, with FedProx (\mu=1.0) achieving a final accuracy </w:t>
-        <w:br/>
-        <w:t>of 51.50%, significantly outperforming FedAvg's 46.92% (a +4.58% gain).</w:t>
+        <w:t>The controlled hyperparameter sweep on the RetinaMNIST benchmark maps the performance boundaries across varying Dirichlet data distributions. Table 2 compiles the final test accuracy and best round-to-round peak accuracy (averaged across seeds 42, 123, and 777) for FedAvg, FedProx (with μ ∈ {0.01, 0.1, 1.0}), and the corrected SCAFFOLD algorithm. Under extreme statistical skew (α=0.05 and 0.1), the proximal penalty acts as an artificial barrier that restricts local adaptation, resulting in a performance drop. For instance, under α=0.1, FedProx with μ=1.0 degrades the final accuracy from 43.50% (FedAvg) to 41.00%. However, under moderate to low heterogeneity (α=0.3 and 1.0), the proximal constraint successfully stabilizes training and restricts client drift, with FedProx (μ=1.0) achieving a final accuracy of 51.50%, significantly outperforming FedAvg's 46.92% (a +4.58% gain).</w:t>
       </w:r>
     </w:p>
     <w:tbl>
@@ -4990,7 +4988,7 @@
     </w:p>
     <w:p>
       <w:pPr>
-        <w:spacing w:before="240" w:after="120" w:line="276" w:lineRule="auto"/>
+        <w:spacing w:before="240" w:after="80"/>
         <w:jc w:val="center"/>
       </w:pPr>
       <w:r>
@@ -5042,7 +5040,7 @@
     </w:p>
     <w:p>
       <w:pPr>
-        <w:spacing w:before="240" w:after="120" w:line="276" w:lineRule="auto"/>
+        <w:spacing w:before="240" w:after="80"/>
         <w:jc w:val="center"/>
       </w:pPr>
       <w:r>
@@ -5094,7 +5092,7 @@
     </w:p>
     <w:p>
       <w:pPr>
-        <w:spacing w:before="240" w:after="120" w:line="276" w:lineRule="auto"/>
+        <w:spacing w:before="240" w:after="80"/>
         <w:jc w:val="center"/>
       </w:pPr>
       <w:r>
@@ -5146,7 +5144,7 @@
     </w:p>
     <w:p>
       <w:pPr>
-        <w:spacing w:before="240" w:after="120" w:line="276" w:lineRule="auto"/>
+        <w:spacing w:before="240" w:after="80"/>
         <w:jc w:val="center"/>
       </w:pPr>
       <w:r>
@@ -5217,23 +5215,7 @@
         <w:jc w:val="both"/>
       </w:pPr>
       <w:r>
-        <w:t xml:space="preserve">The experiments were scaled to the clinical fundus images of the IDRiD dataset. Table 3 compiles the sweep metrics </w:t>
-        <w:br/>
-        <w:t xml:space="preserve">for the clinical network (seeds 42, 123, and 777) across concentration parameters \alpha and regularizer weights \mu. </w:t>
-        <w:br/>
-        <w:t xml:space="preserve">Under \alpha=0.3, we observe that FedProx (\mu=1.0, seed 42) reduces client-to-client accuracy standard deviation </w:t>
-        <w:br/>
-        <w:t xml:space="preserve">from 0.0520 down to 0.0159, proving its stabilizing behavior. However, the average final accuracy improvements remain </w:t>
-        <w:br/>
-        <w:t xml:space="preserve">statistically constrained due to the high seed-to-seed variance. Evaluating the observed mean difference in global test accuracy </w:t>
-        <w:br/>
-        <w:t xml:space="preserve">(\Delta = 0.010) against the high seed variance (\sigma = 0.083) yields a Cohen's d effect size of **0.1205**. To achieve </w:t>
-        <w:br/>
-        <w:t xml:space="preserve">a conventional statistical significance level of p &lt; 0.05 with 80% power, the network would require **1,082 seeds** per group. </w:t>
-        <w:br/>
-        <w:t xml:space="preserve">This mathematically proves that the small-scale IDRiD training set (413 samples) is statistically underpowered, necessitating </w:t>
-        <w:br/>
-        <w:t>the ingestion of the scaled 4,075-image IDRiD+APTOS combined dataset.</w:t>
+        <w:t>The experiments were scaled to the clinical fundus images of the IDRiD dataset. Table 3 compiles the sweep metrics for the clinical network (seeds 42, 123, and 777) across concentration parameters α and regularizer weights μ. Under α=0.3, we observe that FedProx (μ=1.0, seed 42) reduces client-to-client accuracy standard deviation from 0.0520 down to 0.0159, proving its stabilizing behavior. However, the average final accuracy improvements remain statistically constrained due to the high seed-to-seed variance. Evaluating the observed mean difference in global test accuracy (Δ = 0.010) against the high seed variance (σ = 0.083) yields a Cohen's d effect size of 0.1205. To achieve a conventional statistical significance level of p &lt; 0.05 with 80% power, the network would require 1,082 seeds per group. This mathematically proves that the small-scale IDRiD training set (413 samples) is statistically underpowered, necessitating the ingestion of the scaled 4,075-image IDRiD+APTOS combined dataset.</w:t>
       </w:r>
     </w:p>
     <w:tbl>
@@ -7525,7 +7507,7 @@
     </w:p>
     <w:p>
       <w:pPr>
-        <w:spacing w:before="240" w:after="120" w:line="276" w:lineRule="auto"/>
+        <w:spacing w:before="240" w:after="80"/>
         <w:jc w:val="center"/>
       </w:pPr>
       <w:r>
@@ -7577,7 +7559,7 @@
     </w:p>
     <w:p>
       <w:pPr>
-        <w:spacing w:before="240" w:after="120" w:line="276" w:lineRule="auto"/>
+        <w:spacing w:before="240" w:after="80"/>
         <w:jc w:val="center"/>
       </w:pPr>
       <w:r>
@@ -7648,19 +7630,7 @@
         <w:jc w:val="both"/>
       </w:pPr>
       <w:r>
-        <w:t xml:space="preserve">To mitigate statistical underpowering, we executed a scaled-up federated training run using the combined </w:t>
-        <w:br/>
-        <w:t xml:space="preserve">4,075-image IDRiD+APTOS training set. Table 4 outlines the results for this large-scale clinical pipeline </w:t>
-        <w:br/>
-        <w:t xml:space="preserve">(alpha=0.1, seed=42). We explicitly frame this as a preliminary, single-configuration result from an in-progress </w:t>
-        <w:br/>
-        <w:t xml:space="preserve">multi-seed sweep. Broader clinical conclusions and generalized performance assertions await the completion of the full </w:t>
-        <w:br/>
-        <w:t xml:space="preserve">multi-seed sweep. Nonetheless, in this initial run, federated training on this larger volume of clinical images achieves </w:t>
-        <w:br/>
-        <w:t xml:space="preserve">a peak global test accuracy of **55.34%** (which is identical to the centralized baseline accuracy of 55.34%), showing </w:t>
-        <w:br/>
-        <w:t>the promise of federated learning scaling under India's DPDP Act constraints.</w:t>
+        <w:t>To mitigate statistical underpowering, we executed a scaled-up federated training run using the combined 4,075-image IDRiD+APTOS training set. Table 4 outlines the results for this large-scale clinical pipeline (alpha=0.1, seed=42). We explicitly frame this as a preliminary, single-configuration result from an in-progress multi-seed sweep. Broader clinical conclusions and generalized performance assertions await the completion of the full multi-seed sweep. Nonetheless, in this initial run, federated training on this larger volume of clinical images achieves a peak global test accuracy of 55.34% (which is identical to the centralized baseline accuracy of 55.34%), showing the promise of federated learning scaling under India's DPDP Act constraints.</w:t>
       </w:r>
     </w:p>
     <w:tbl>
@@ -8025,30 +7995,7 @@
         <w:jc w:val="both"/>
       </w:pPr>
       <w:r>
-        <w:t xml:space="preserve">During our initial sweeps, a critical anomaly was detected where the SCAFFOLD strategy produced a flat global </w:t>
-        <w:br/>
-        <w:t xml:space="preserve">accuracy of exactly 43.50% across all concentration parameters \alpha. This was diagnosed as an implementation </w:t>
-        <w:br/>
-        <w:t xml:space="preserve">bug where: (1) BatchNorm running statistics (running mean and variance) were omitted during global-local weight exchange, </w:t>
-        <w:br/>
-        <w:t xml:space="preserve">retaining random initializations at evaluation; and (2) global and client control variates signature positions were swapped, </w:t>
-        <w:br/>
-        <w:t xml:space="preserve">applying drift corrections with the wrong sign. Redefining model weights exchange using the full state_dict and correcting the </w:t>
-        <w:br/>
-        <w:t xml:space="preserve">control signature resolved the issue. </w:t>
-        <w:br/>
-        <w:br/>
-        <w:t xml:space="preserve">In our verification runs (Table 2), SCAFFOLD demonstrated improved stability at concentration parameters \alpha=0.05, 0.3, </w:t>
-        <w:br/>
-        <w:t xml:space="preserve">and 1.0, achieving mean final accuracies of **48.50%**, **48.83%**, and **48.00%** respectively. However, under \alpha=0.1, </w:t>
-        <w:br/>
-        <w:t xml:space="preserve">SCAFFOLD exhibits an anomalous mean final accuracy of **23.33%** (with a peak best accuracy of 47.50%), showing an unresolved </w:t>
-        <w:br/>
-        <w:t xml:space="preserve">anomaly that is under continued active investigation. This indicates that while the control variate bug is successfully </w:t>
-        <w:br/>
-        <w:t xml:space="preserve">resolved structurally, training stability under certain intermediate skews remains highly sensitive to local hyperparameters </w:t>
-        <w:br/>
-        <w:t>and requires further tuning.</w:t>
+        <w:t>During our initial sweeps, a critical anomaly was detected where the SCAFFOLD strategy produced a flat global accuracy of exactly 43.50% across all concentration parameters α. This was diagnosed as an implementation bug where: (1) BatchNorm running statistics (running mean and variance) were omitted during global-local weight exchange, retaining random initializations at evaluation; and (2) global and client control variates signature positions were swapped, applying drift corrections with the wrong sign. Redefining model weights exchange using the full state_dict and correcting the control signature resolved the issue. In our verification runs (Table 2), SCAFFOLD demonstrated improved stability at concentration parameters α=0.05, 0.3, and 1.0, achieving mean final accuracies of 48.50%, 48.83%, and 48.00% respectively. However, under α=0.1, SCAFFOLD exhibits an anomalous mean final accuracy of 23.33% (with a peak best accuracy of 47.50%), showing an unresolved anomaly that is under continued active investigation. This indicates that while the control variate bug is successfully resolved structurally, training stability under certain intermediate skews remains highly sensitive to local hyperparameters and requires further tuning.</w:t>
       </w:r>
     </w:p>
     <w:p>
@@ -8072,25 +8019,7 @@
         <w:jc w:val="both"/>
       </w:pPr>
       <w:r>
-        <w:t xml:space="preserve">This empirical study systematically maps the operational boundaries of federated diabetic retinopathy grading under statistical </w:t>
-        <w:br/>
-        <w:t xml:space="preserve">heterogeneity, contextualized within the compliance requirements of India's DPDP Act of 2023. Our experiments verify a distinct </w:t>
-        <w:br/>
-        <w:t xml:space="preserve">performance phase transition: proximal regularization degrades accuracy under extreme heterogeneity but provides up to a +4.58% </w:t>
-        <w:br/>
-        <w:t xml:space="preserve">accuracy gain under moderate heterogeneity. Importantly, regularized federated training serves as a clinical fairness stabilizer, </w:t>
-        <w:br/>
-        <w:t xml:space="preserve">reducing inter-client accuracy variance and boosting the worst-performing client's accuracy by +27.69% relative to FedAvg. </w:t>
-        <w:br/>
-        <w:t xml:space="preserve">We also resolve the SCAFFOLD implementation bug, proving that correcting control variate updates stabilizes optimization. Finally, </w:t>
-        <w:br/>
-        <w:t xml:space="preserve">our power analysis reveals that small clinical cohorts are statistically underpowered, validating the necessity of a combined </w:t>
-        <w:br/>
-        <w:t xml:space="preserve">IDRiD+APTOS scaled-up training pipeline which successfully restores performance to centralized levels (55.34%). Future work </w:t>
-        <w:br/>
-        <w:t xml:space="preserve">will focus on developing adaptive regularization techniques to dynamically tune \mu based on local class divergence, and </w:t>
-        <w:br/>
-        <w:t>validating the corrected SCAFFOLD pipeline across larger clinical networks.</w:t>
+        <w:t>This empirical study systematically maps the operational boundaries of federated diabetic retinopathy grading under statistical heterogeneity, contextualized within the compliance requirements of India's DPDP Act of 2023. Our experiments verify a distinct performance phase transition: proximal regularization degrades accuracy under extreme heterogeneity but provides up to a +4.58% accuracy gain under moderate heterogeneity. Importantly, regularized federated training serves as a clinical fairness stabilizer, reducing inter-client accuracy variance and boosting the worst-performing client's accuracy by +27.69% relative to FedAvg. We also resolve the SCAFFOLD implementation bug, proving that correcting control variate updates stabilizes optimization. Finally, our power analysis reveals that small clinical cohorts are statistically underpowered, validating the necessity of a combined IDRiD+APTOS scaled-up training pipeline which successfully restores performance to centralized levels (55.34%). Future work will focus on developing adaptive regularization techniques to dynamically tune μ based on local class divergence, and validating the corrected SCAFFOLD pipeline across larger clinical networks.</w:t>
       </w:r>
     </w:p>
     <w:p>
@@ -8114,7 +8043,7 @@
         <w:jc w:val="left"/>
       </w:pPr>
       <w:r>
-        <w:t>[1] B. McMahan, E. Moore, D. Ramage, S. Hampson, and B. A. y Arcas, "Communication-efficient learning of deep networks from decentralized data," in *International Conference on Artificial Intelligence and Statistics*, 2017, pp. 1273-1282.</w:t>
+        <w:t>[1] B. McMahan, E. Moore, D. Ramage, S. Hampson, and B. A. y Arcas, "Communication-efficient learning of deep networks from decentralized data," in International Conference on Artificial Intelligence and Statistics, 2017, pp. 1273-1282.</w:t>
       </w:r>
     </w:p>
     <w:p>
@@ -8123,7 +8052,7 @@
         <w:jc w:val="left"/>
       </w:pPr>
       <w:r>
-        <w:t>[2] T. Li, A. K. Sahu, M. Zaheer, M. Sanjabi, A. Talwalkar, and V. Smith, "Federated optimization in heterogeneous networks," *Proceedings of Machine Learning and Systems*, vol. 2, pp. 429-450, 2020.</w:t>
+        <w:t>[2] T. Li, A. K. Sahu, M. Zaheer, M. Sanjabi, A. Talwalkar, and V. Smith, "Federated optimization in heterogeneous networks," Proceedings of Machine Learning and Systems, vol. 2, pp. 429-450, 2020.</w:t>
       </w:r>
     </w:p>
     <w:p>
@@ -8132,7 +8061,7 @@
         <w:jc w:val="left"/>
       </w:pPr>
       <w:r>
-        <w:t>[3] S. P. Karimireddy, S. Kale, M. Mohri, S. Reddi, S. U. Stich, and A. T. Suresh, "SCAFFOLD: Stochastic controlled averaging for federated learning," in *International Conference on Machine Learning*, 2020, pp. 5132-5143.</w:t>
+        <w:t>[3] S. P. Karimireddy, S. Kale, M. Mohri, S. Reddi, S. U. Stich, and A. T. Suresh, "SCAFFOLD: Stochastic controlled averaging for federated learning," in International Conference on Machine Learning, 2020, pp. 5132-5143.</w:t>
       </w:r>
     </w:p>
     <w:p>
@@ -8141,7 +8070,7 @@
         <w:jc w:val="left"/>
       </w:pPr>
       <w:r>
-        <w:t>[4] T. M. Hsu, H. Qi, and M. Brown, "Measuring the effects of non-identically distributed data on federated learning," *arXiv preprint arXiv:1909.06335*, 2019.</w:t>
+        <w:t>[4] T. M. Hsu, H. Qi, and M. Brown, "Measuring the effects of non-identically distributed data on federated learning," arXiv preprint arXiv:1909.06335, 2019.</w:t>
       </w:r>
     </w:p>
     <w:p>
@@ -8150,7 +8079,7 @@
         <w:jc w:val="left"/>
       </w:pPr>
       <w:r>
-        <w:t>[5] Q. Li, Y. Diao, Q. Chen, and B. He, "Federated learning on non-iid data: An empirical study," *arXiv preprint arXiv:2106.06843*, 2021.</w:t>
+        <w:t>[5] Q. Li, Y. Diao, Q. Chen, and B. He, "Federated learning on non-iid data: An empirical study," arXiv preprint arXiv:2106.06843, 2021.</w:t>
       </w:r>
     </w:p>
     <w:p>
@@ -8159,7 +8088,7 @@
         <w:jc w:val="left"/>
       </w:pPr>
       <w:r>
-        <w:t>[6] J. Yang, R. Shi, D. Wei, Z. Liu, L. Zhao, B. Ke, and Y. Wang, "MedMNIST v2: A large-scale lightweight benchmark for 2D and 3D biomedical image classification," *Scientific Data*, vol. 10, no. 1, p. 17, 2023.</w:t>
+        <w:t>[6] J. Yang, R. Shi, D. Wei, Z. Liu, L. Zhao, B. Ke, and Y. Wang, "MedMNIST v2: A large-scale lightweight benchmark for 2D and 3D biomedical image classification," Scientific Data, vol. 10, no. 1, p. 17, 2023.</w:t>
       </w:r>
     </w:p>
     <w:p>
@@ -8168,7 +8097,7 @@
         <w:jc w:val="left"/>
       </w:pPr>
       <w:r>
-        <w:t>[7] S. Mohan et al., "Federated learning for diabetic retinopathy detection using clinical fundus images," *Journal of Biomedical Informatics*, vol. 142, p. 104373, 2023.</w:t>
+        <w:t>[7] S. Mohan et al., "Federated learning for diabetic retinopathy detection using clinical fundus images," Journal of Biomedical Informatics, vol. 142, p. 104373, 2023.</w:t>
       </w:r>
     </w:p>
     <w:sectPr>

</xml_diff>

<commit_message>
style: rewrite entire report in a natural, human academic voice following stylistic guidelines
</commit_message>
<xml_diff>
--- a/report_draft.docx
+++ b/report_draft.docx
@@ -56,7 +56,7 @@
         <w:jc w:val="both"/>
       </w:pPr>
       <w:r>
-        <w:t>Diabetic Retinopathy (DR) represents an escalating public health challenge in India, where an estimated 101 million individuals live with diabetes mellitus. Early screening is vital to mitigate preventable blindness, yet regional diagnostic infrastructure is limited by a severe shortage of rural ophthalmologists. While centralized deep learning pipelines achieve high clinical diagnostic performance, aggregating patient retinal fundus images cross-institutionally violates patient privacy and runs counter to the localization mandates of the Indian Digital Personal Data Protection (DPDP) Act of 2023. Federated Learning (FL) presents a viable solution by enabling decentralized clinical nodes to collaboratively train models without transmitting raw medical data. In this study, we construct a robust single-process manual FL simulation loop to compare the Federated Averaging (FedAvg) and Federated Proximal (FedProx) algorithms under varying degrees of simulated statistical heterogeneity (non-IID) modeled using Dirichlet distributions. We benchmark optimization performance using two datasets: the synthetic RetinaMNIST benchmark (with a custom 3-layer RetinaCNN) and clinical fundus image data from the Indian Diabetic Retinopathy Image Dataset (IDRiD) using a pre-trained EfficientNet-B0 backbone. Empirically, we verify a performance phase transition where proximal regularization degrades global accuracy under severe class skew but improves performance under moderate skew. Crucially, we prove that FedProx serves as a clinical fairness stabilizer, boosting worst-client accuracy by up to 27.69% and reducing inter-client variance. Furthermore, we establish the statistical limits of small-scale clinical datasets through a Cohen's d power analysis, validating the necessity of a combined 4,075-image IDRiD+APTOS scaling pipeline.</w:t>
+        <w:t>Diabetic retinopathy is one of the leading causes of preventable blindness in India, a country with over 101 million people living with diabetes. Screening is the bottleneck: most rural areas simply don't have enough ophthalmologists, and a large share of cases go undiagnosed until vision loss is already advanced. Deep learning models can grade retinal images automatically, but training them well normally means pooling large amounts of patient data from different hospitals — something India's Digital Personal Data Protection Act (2023) makes legally difficult, since it requires patient data to stay where it was collected. Federated learning offers a way around this: instead of moving data to a central server, the model itself moves between hospitals, and only its weights are shared. This project builds a federated learning simulation from scratch to study how FedAvg and FedProx behave when hospital data is highly imbalanced — some clinics seeing mostly healthy patients, others seeing mostly severe cases. We test this on two datasets: RetinaMNIST, a small controlled benchmark, and IDRiD, a real clinical dataset collected in Karnataka, India. The central finding is that FedProx doesn't behave the same way across all conditions — it can hurt accuracy when data is extremely skewed, but help once the skew is more moderate, revealing a clear switch-over point that hasn't been characterized this way before. We also find that FedProx makes the worst-performing hospital substantially more accurate, even in cases where it doesn't change the overall average — a fairness effect that matters more in a clinical setting than raw accuracy alone. Finally, a statistical power analysis suggests that IDRiD's small size limits how confidently these effects can be measured, which motivated scaling up with a combined IDRiD+APTOS dataset.</w:t>
       </w:r>
     </w:p>
     <w:p>
@@ -95,7 +95,7 @@
         <w:jc w:val="both"/>
       </w:pPr>
       <w:r>
-        <w:t>Diabetic Retinopathy (DR) is a microvascular complication of diabetes mellitus that leads to progressive, irreversible vision impairment if left diagnosed. India currently bears a substantial share of the global diabetic burden, with over 101 million diagnosed individuals and another 136 million classified as pre-diabetic. The clinical screening pipeline is severely bottlenecked: the ratio of ophthalmologists to the population in rural India is critically low, leaving over 50-70% of diabetic patients unscreened until advanced visual deficit occurs. Deep learning architectures, particularly Convolutional Neural Networks (CNNs), have demonstrated near-human classification accuracy in grading DR severity from color fundus photographs. Training these models requires aggregating hundreds of thousands of high-resolution clinical images from diverse demographic populations to generalize across variations in fundus camera optics, lighting conditions, and clinical cohorts.</w:t>
+        <w:t>Diabetic retinopathy develops when high blood sugar damages the blood vessels in the retina. Left unchecked, it leads to permanent vision loss — but caught early, it's manageable. The problem in India isn't the disease itself, it's access: there simply aren't enough ophthalmologists to screen the country's diabetic population, and a large share of patients don't get diagnosed until the damage is already severe. Convolutional neural networks have gotten quite good at grading retinal images automatically, but they need a lot of varied training data to generalize across different cameras, lighting setups, and patient populations. That data usually lives in different hospitals, and getting it all into one place isn't just a technical problem — it runs into India's 2023 data protection law directly.</w:t>
       </w:r>
     </w:p>
     <w:p>
@@ -104,7 +104,7 @@
         <w:jc w:val="both"/>
       </w:pPr>
       <w:r>
-        <w:t>Centralized data aggregation, however, faces significant regulatory and ethical barriers. In 2023, India enacted the Digital Personal Data Protection (DPDP) Act, which strictly regulates the processing of personal and sensitive personal data. The DPDP Act enforces strict consent architecture, patient-centric data deletion rights, and localization principles. Hospitals and diagnostic clinics can no longer legally upload raw clinical datasets to external cloud servers or share patient retinal scans with third-party developers without substantial compliance overhead and legal liability. This creates an architectural impasse: clinical institutions cannot centralize patient data to train diagnostic networks, yet local datasets at individual clinics are too small and class-imbalanced to build robust models independently.</w:t>
+        <w:t>The DPDP Act requires that personal data, including medical scans, largely stay where it was collected, with strict rules around consent and deletion. That leaves hospitals in an awkward spot: they can't send their data elsewhere to build a shared model, but on their own, most clinics don't have enough images (or enough variety in cases) to train something reliable. Federated learning is built for exactly this situation — the model is trained locally at each hospital and only its parameters are sent to a central server for averaging, so the raw scans never leave the building.</w:t>
       </w:r>
     </w:p>
     <w:p>
@@ -113,16 +113,7 @@
         <w:jc w:val="both"/>
       </w:pPr>
       <w:r>
-        <w:t>Federated Learning (FL) resolves this conflict by shifting from data aggregation to model aggregation. Under the FL framework, the clinical model parameters travel between hospital client nodes while patient data remains localized inside each institution's firewall. Standard Federated Averaging (FedAvg) aggregates client weights using sample-weighted averaging. However, clinical networks in India exhibit massive statistical heterogeneity (non-IID data) across regional silos. Hospitals face significant variation in class distribution (clinical skew) and sample size (volume skew) due to regional demographic imbalances and clinical specializations (e.g., tertiary eye care centers versus primary clinics). In these heterogeneous regimes, local models drift toward local minima, causing FedAvg's aggregated global model to diverge.</w:t>
-      </w:r>
-    </w:p>
-    <w:p>
-      <w:pPr>
-        <w:spacing w:before="0" w:after="120" w:line="276" w:lineRule="auto"/>
-        <w:jc w:val="both"/>
-      </w:pPr>
-      <w:r>
-        <w:t>To mitigate client drift under non-IID conditions, regularized frameworks like FedProx introduce a proximal regularization penalty (parameter μ) that limits the deviation of local updates from the global model state. However, the exact operational boundaries under which proximal regularization helps or hurts global convergence and local client equity remain poorly characterized in clinical settings. This study addresses this gap by executing a rigorous hyperparameter sweep across Dirichlet concentration parameters (α ∈ {0.05, 0.1, 0.3, 1.0}) and regularization weights (μ ∈ {0.0, 0.01, 0.1, 1.0}). Furthermore, we analyze the performance of a third algorithm, SCAFFOLD, which utilizes control variates to correct client-drift, detailing an implementation bug in the control variates that was successfully resolved during our verification sweep. Finally, we analyze the statistical power limits of small clinical cohorts, demonstrating the mathematical necessity of multi-silo pipeline scaling via a combined 4,075-image training set.</w:t>
+        <w:t>The standard method, FedAvg, works well when different hospitals' data looks roughly similar. It doesn't work as well when it doesn't. In practice, one hospital's patient population might be mostly mild or undiagnosed cases, while another sees almost exclusively severe, referred cases — and when each hospital trains on only its own skewed slice of the world, their models start pulling in different directions. Averaging models that disagree this much doesn't produce a good global model; it produces one that's confused. FedProx was proposed as a fix, adding a term to each hospital's local training that discourages it from drifting too far from the shared model. What's less clear — and what this project investigates — is exactly when that correction actually helps, and when it gets in the way.</w:t>
       </w:r>
     </w:p>
     <w:p>
@@ -198,7 +189,7 @@
         <w:jc w:val="both"/>
       </w:pPr>
       <w:r>
-        <w:t>The literature surrounding collaborative machine learning for medical imaging is grouped into three main categories: (a) centralized diabetic retinopathy classification, (b) optimization algorithms for federated learning under client drift, and (c) empirical benchmarking under simulated statistical heterogeneity.</w:t>
+        <w:t>Most work on collaborative learning for medical imaging falls into three buckets: standard centralized classification models, federated optimization algorithms designed to combat client drift, and empirical tests under simulated data skew.</w:t>
       </w:r>
     </w:p>
     <w:p>
@@ -207,7 +198,7 @@
         <w:jc w:val="both"/>
       </w:pPr>
       <w:r>
-        <w:t>Centralized deep learning models for diabetic retinopathy grading have achieved significant success using pre-trained backbones like ResNet and EfficientNet. However, these models depend entirely on centralized clinical databases. The emergence of federated learning in healthcare [1] offered a privacy-preserving alternative. Collaborative architectures specifically applied to medical imaging [7] highlight the feasibility of training diagnostic classifiers on fundus images without aggregating raw scans. Despite these advancements, medical datasets suffer from extreme class imbalances and scanner heterogeneity, which compromises model generalization.</w:t>
+        <w:t>Centralized deep learning models for diabetic retinopathy have gotten very good, typically using backbones like ResNet and EfficientNet. The catch is that they rely on having all the training data in one place. Federated learning [1] was introduced to avoid this requirement in healthcare. Recent papers [7] show it is possible to train diagnostic classifiers on retinal images without moving raw scans. Even so, medical federated learning still struggles with clinical skew and variation in camera hardware, which can cause local updates to diverge.</w:t>
       </w:r>
     </w:p>
     <w:p>
@@ -216,7 +207,7 @@
         <w:jc w:val="both"/>
       </w:pPr>
       <w:r>
-        <w:t>To stabilize decentralized training, optimization variants have modified the local loss function. The foundational algorithm, Federated Averaging (FedAvg) [1], performs local gradient updates and aggregates parameters at the server. FedProx [2] restricts local client drift by adding an L₂ proximal term, penalizing updates that deviate from the global model. In parallel, variance-reduction methods like SCAFFOLD [3] introduce global and client control variates to dynamically correct the gradient update directions. Empirical surveys of federated optimization [5] show that while regularization is highly effective under moderate heterogeneity, its performance degrades under severe non-IID conditions, emphasizing the need to characterize regularization thresholds.</w:t>
+        <w:t>To keep local training from drifting, researchers usually modify the local loss function. The base method, FedAvg [1], simply averages client weights. FedProx [2] restricts how far local parameters can wander by adding an L₂ proximal penalty that keeps client updates anchored near the global model. Meanwhile, SCAFFOLD [3] uses control variates to track and correct gradient updates. Surveys [5] suggest that while regularization can stabilize training under moderate skew, it often hurts convergence under extreme non-IID conditions. The threshold where this behavior flips is what we focus on.</w:t>
       </w:r>
     </w:p>
     <w:p>
@@ -225,7 +216,7 @@
         <w:jc w:val="both"/>
       </w:pPr>
       <w:r>
-        <w:t>Simulating clinical heterogeneity is typically achieved using Dirichlet distribution partitioning. First popularized by Hsu et al. [4], class-wise Dirichlet sampling allocates class indices to simulated client nodes using a concentration parameter α. Under small concentration parameters (e.g., α &lt; 0.1), the partitioner models severe, realistic diagnostic skew where individual clinics lack entire categories of disease. Lightweight benchmarks like RetinaMNIST (from MedMNIST v2) [6] provide a standardized, computationally tractable platform to run extensive hyperparameter grids, allowing researchers to isolate the impacts of class skew and regularization without the confounding effects of extremely high-resolution image processing.</w:t>
+        <w:t>Simulating clinical heterogeneity in a lab setting is typically done using Dirichlet distributions. Class-wise Dirichlet sampling, introduced by Hsu et al. [4], distributes classes to clients based on a concentration parameter α. Lower α values (like α &lt; 0.1) simulate severe skew, where some clinics lack entire categories of disease. Lightweight benchmarks like RetinaMNIST (part of MedMNIST v2) [6] let us run wide hyperparameter sweeps on small images, isolating the effect of skew and regularization without the computational baggage of high-resolution processing.</w:t>
       </w:r>
     </w:p>
     <w:p>
@@ -264,7 +255,7 @@
         <w:jc w:val="both"/>
       </w:pPr>
       <w:r>
-        <w:t>To classify the 5 grades of Diabetic Retinopathy (DR) on the 28x28 pixel images of the RetinaMNIST dataset, we design RetinaCNN, a customized 3-layer Convolutional Neural Network. RetinaCNN comprises three sequential Conv2d blocks. Block 1 utilizes 16 output filters (3×3 kernel, stride=1, padding=1) followed by BatchNorm2d, a ReLU activation, and MaxPool2d (stride=2), reducing spatial dimensions to 14x14. Block 2 scales channel width to 32 filters, outputting 7x7 spatial maps. Block 3 utilizes 64 filters, yielding 3x3 maps. The classifier head flattens the 576-dimensional feature representation and routes it through a Linear layer (128 units), a ReLU activation, a Dropout layer (p=0.3), and a final Linear projection layer to output 5 logits corresponding to the 5 DR severity grades. The total trainable parameter count is exactly 98,309 (as verified via structural numel queries), ensuring rapid convergence and preventing overfitting on small client silos.</w:t>
+        <w:t>For the small 28x28 images in RetinaMNIST, we use RetinaCNN, a basic 3-layer convolutional network. It consists of three convolutional blocks: the first has 16 filters (3×3 kernel, stride 1, padding 1) with BatchNorm and MaxPool, shrinking the map to 14x14; the second has 32 filters (yielding 7x7); and the third has 64 filters (yielding 3x3). The classifier flattens this 576-dimensional output and runs it through a 128-unit linear layer, ReLU, dropout (p=0.3), and a final 5-unit projection. This model contains exactly 98,309 parameters, which is small enough to train quickly without overfitting on small partitions.</w:t>
       </w:r>
     </w:p>
     <w:p>
@@ -273,7 +264,7 @@
         <w:jc w:val="both"/>
       </w:pPr>
       <w:r>
-        <w:t>For clinical grading on the high-resolution Indian Diabetic Retinopathy Image Dataset (IDRiD) from Vijayanagar Institute of Medical Sciences, Karnataka, we employ a pre-trained EfficientNet-B0 backbone (5.3M parameters) via the timm library. The model is pretrained on ImageNet, and the final classification layer is replaced with a 5-unit Linear classifier. Retinal fundus photographs are dynamically resized to 224x224 pixels, normalized, and augmented with random cropping, horizontal flipping, rotation, and ColorJitter (brightness and contrast) to simulate clinical imaging variations.</w:t>
+        <w:t>For the clinical IDRiD images, we use a pre-trained EfficientNet-B0 backbone (about 5.3 million parameters) via the timm library. We swap the final classification head for a 5-unit linear layer to match the diabetic retinopathy grades. The fundus photographs are resized to 224x224, normalized, and augmented with random crops, flips, rotation, and color jitter to mimic variations in camera hardware and lighting.</w:t>
       </w:r>
     </w:p>
     <w:p>
@@ -297,7 +288,7 @@
         <w:jc w:val="both"/>
       </w:pPr>
       <w:r>
-        <w:t>To simulate clinical data partitions across K hospital nodes, we employ class-wise Dirichlet partitioning [4]. For each DR grade class c ∈ {0, 1, 2, 3, 4}, we sample a partition vector q_c ~ Dirichlet(α · 1_K) where α is the concentration parameter. The client allocation index distributes samples such that lower α values (e.g., α = 0.05) result in severe class exclusion across clients. In this study, we swept α ∈ {0.05, 0.1, 0.3, 1.0} to cover regimes from extreme clinical skew (where clients only have 1 or 2 classes) to homogeneous class structures (near-IID).</w:t>
+        <w:t>We simulate skewed data distributions across K hospital clients using Dirichlet partitioning [4]. For each disease grade c ∈ {0, 1, 2, 3, 4}, we draw client proportions from a Dirichlet distribution with parameter α. Small α values (e.g., α = 0.05) mean some classes are completely missing from certain clients. We sweep α through 0.05, 0.1, 0.3, and 1.0 to see how optimization algorithms handle the transition from extreme class skew to a near-IID setup.</w:t>
       </w:r>
     </w:p>
     <w:p>
@@ -373,7 +364,7 @@
         <w:jc w:val="both"/>
       </w:pPr>
       <w:r>
-        <w:t>The federated system is implemented as a manual, single-process Python training loop. This implementation design was chosen intentionally to circumvent the VRAM overhead and runtime instability of distributed frameworks (such as Flower, Ray, or Docker) on compute-constrained workstations. The simulation ran on a local Ubuntu workstation equipped with an Intel Core i7-13700 CPU and an NVIDIA RTX A2000 12GB VRAM GPU. The local training loops utilize PyTorch's native Cuda structures. Parallel data loading is implemented using DataLoader with num_workers=4 and pin_memory=True to eliminate disk I/O bottlenecks. Figure 3 visually maps this client-server topology, highlighting the privacy constraints.</w:t>
+        <w:t>We built the federated loop in a single process rather than using distributed frameworks like Flower or Ray. This avoids the VRAM overhead and configuration headaches that usually come with running distributed software on a single workstation. All training runs on a local Ubuntu workstation with an Intel i7-13700 CPU and a single NVIDIA RTX A2000 GPU (12GB VRAM). The simulation handles PyTorch CUDA allocation, using four workers and pinned memory to prevent data-loading bottlenecks. Figure 3 shows this setup, highlighting the boundary that keeps patient data inside each client silo.</w:t>
       </w:r>
     </w:p>
     <w:p>
@@ -449,7 +440,7 @@
         <w:jc w:val="both"/>
       </w:pPr>
       <w:r>
-        <w:t>The baseline Federated Averaging (FedAvg) aggregates parameters by computing a sample-size weighted average:</w:t>
+        <w:t>In Federated Averaging (FedAvg), the server updates the global model by taking a sample-weighted average of the client parameters at each round:</w:t>
       </w:r>
     </w:p>
     <w:p>
@@ -473,7 +464,7 @@
         <w:jc w:val="both"/>
       </w:pPr>
       <w:r>
-        <w:t>where w_k^(t+1) represents local weight parameters updated over E epochs at client k using standard Cross-Entropy Loss.</w:t>
+        <w:t>where w_k^(t+1) represents the local weights updated at client k over E epochs using standard Cross-Entropy Loss.</w:t>
       </w:r>
     </w:p>
     <w:p>
@@ -482,7 +473,7 @@
         <w:jc w:val="both"/>
       </w:pPr>
       <w:r>
-        <w:t>The Federated Proximal (FedProx) algorithm [2] modifies the local objective function by adding an L₂ regularization penalty to restrict local parameter drift:</w:t>
+        <w:t>FedProx [2] adds a proximal penalty to the local client loss to penalize updates that move too far from the global starting point:</w:t>
       </w:r>
     </w:p>
     <w:p>
@@ -506,7 +497,7 @@
         <w:jc w:val="both"/>
       </w:pPr>
       <w:r>
-        <w:t>where wᵗ is the broadcast global model parameter set at round t, and μ is the regularization multiplier. The parameter difference term acts as a trust region constraint.</w:t>
+        <w:t>The parameter μ scales this penalty, which acts as a trust region constraint around the global model wᵗ.</w:t>
       </w:r>
     </w:p>
     <w:p>
@@ -567,7 +558,7 @@
         <w:jc w:val="both"/>
       </w:pPr>
       <w:r>
-        <w:t>For SCAFFOLD [3], the client updates are corrected using control variates. The local gradient step is adjusted by the difference between the global control variate c and the client control variate c_k:</w:t>
+        <w:t>SCAFFOLD [3] takes a different approach, adjusting the local gradient step using client and server control variates (c_k and c):</w:t>
       </w:r>
     </w:p>
     <w:p>
@@ -591,7 +582,7 @@
         <w:jc w:val="both"/>
       </w:pPr>
       <w:r>
-        <w:t>At the end of local training, the client control variate is updated. To avoid momentum mismatch under adaptive optimizers or SGD momentum, we implement the gradient-accumulation Option II variant of SCAFFOLD, where c_k⁺ is computed directly from the average uncorrected local gradients accumulated over the step:</w:t>
+        <w:t>We implement the gradient-accumulation (Option II) version of SCAFFOLD. This avoids issues when using SGD with momentum or adaptive optimizers by updating the client control variates from the uncorrected gradients accumulated during the step:</w:t>
       </w:r>
     </w:p>
     <w:p>
@@ -615,7 +606,7 @@
         <w:jc w:val="both"/>
       </w:pPr>
       <w:r>
-        <w:t>and the global control variate updates as the average change:</w:t>
+        <w:t>The server then updates the global control variate by averaging the changes:</w:t>
       </w:r>
     </w:p>
     <w:p>
@@ -669,7 +660,7 @@
         <w:jc w:val="both"/>
       </w:pPr>
       <w:r>
-        <w:t>To establish a clinical diagnostic upper bound, we trained a centralized model on the full 413-image IDRiD training set using locked hyperparameters: AdamW (learning rate η=1e-4, weight decay =1e-2), CosineAnnealingLR (T_max=25), and data augmentations. The centralized baseline achieved a global test accuracy of 55.34% at epoch 4. Table 1 outlines the hyperparameters and training outcomes. In a federated setup under extreme non-IID conditions (α=0.3), a single local client training independently on its own partition (Client 0, 301 samples) and evaluated on the global test set reaches a peak accuracy of only 42.72% (at epoch 19). The confusion matrix for this local model (Table 1) demonstrates severe misclassification bias, primarily over-predicting the majority class due to local class imbalances.</w:t>
+        <w:t>To establish a baseline, we trained a model centrally on all 413 IDRiD images using AdamW (learning rate η=1e-4, weight decay 1e-2) and a Cosine Annealing scheduler (T_max=25). This centralized model peaked at 55.34% global accuracy at epoch 4 (Table 1). For comparison, a single hospital client (Client 0) training on only its local slice of the data (301 images, α=0.3) achieves a peak global accuracy of just 42.72% at round 19. The local model's confusion matrix in Table 1 shows a heavy bias: it overpredicts Class 2 because its local data is skewed, demonstrating why small clinics struggle to build useful models on their own.</w:t>
       </w:r>
     </w:p>
     <w:tbl>
@@ -1946,7 +1937,7 @@
         <w:jc w:val="both"/>
       </w:pPr>
       <w:r>
-        <w:t>The controlled hyperparameter sweep on the RetinaMNIST benchmark maps the performance boundaries across varying Dirichlet data distributions. Table 2 compiles the final test accuracy and best round-to-round peak accuracy (averaged across seeds 42, 123, and 777) for FedAvg, FedProx (with μ ∈ {0.01, 0.1, 1.0}), and the corrected SCAFFOLD algorithm. Under extreme statistical skew (α=0.05 and 0.1), the proximal penalty acts as an artificial barrier that restricts local adaptation, resulting in a performance drop. For instance, under α=0.1, FedProx with μ=1.0 degrades the final accuracy from 43.50% (FedAvg) to 41.00%. However, under moderate to low heterogeneity (α=0.3 and 1.0), the proximal constraint successfully stabilizes training and restricts client drift, with FedProx (μ=1.0) achieving a final accuracy of 51.50%, significantly outperforming FedAvg's 46.92% (a +4.58% gain).</w:t>
+        <w:t>Table 2 shows the full sweep across heterogeneity levels and regularization strengths, averaged over three seeds. The pattern that emerges is not what a naive reading of FedProx would predict. Under severe skew (α = 0.05 and 0.1), pushing the regularization strength up hurts rather than helps — at α = 0.1, going from no regularization to μ = 1.0 drops accuracy from 43.50% to 41.00%. It's only once the data becomes more balanced (α = 0.3 and above) that the same strong regularization starts paying off, reaching 51.50% versus FedAvg's 46.92% — a genuine 4.58-point gain. In other words, FedProx isn't uniformly better or worse than FedAvg; its usefulness flips depending on how unevenly the data is distributed in the first place, and that crossover happens somewhere between α = 0.1 and α = 0.3.</w:t>
       </w:r>
     </w:p>
     <w:tbl>
@@ -5215,7 +5206,7 @@
         <w:jc w:val="both"/>
       </w:pPr>
       <w:r>
-        <w:t>The experiments were scaled to the clinical fundus images of the IDRiD dataset. Table 3 compiles the sweep metrics for the clinical network (seeds 42, 123, and 777) across concentration parameters α and regularizer weights μ. Under α=0.3, we observe that FedProx (μ=1.0, seed 42) reduces client-to-client accuracy standard deviation from 0.0520 down to 0.0159, proving its stabilizing behavior. However, the average final accuracy improvements remain statistically constrained due to the high seed-to-seed variance. Evaluating the observed mean difference in global test accuracy (Δ = 0.010) against the high seed variance (σ = 0.083) yields a Cohen's d effect size of 0.1205. To achieve a conventional statistical significance level of p &lt; 0.05 with 80% power, the network would require 1,082 seeds per group. This mathematically proves that the small-scale IDRiD training set (413 samples) is statistically underpowered, necessitating the ingestion of the scaled 4,075-image IDRiD+APTOS combined dataset.</w:t>
+        <w:t>We scaled the sweep to the actual IDRiD clinical scans. Under moderate skew (α=0.3), adding the proximal penalty (μ=1.0) on seed 42 helped stabilize training: the client-to-client standard deviation dropped from 0.0520 to 0.0159. However, when we look at the average final accuracy across all configurations, the improvements are small and easily drowned out by seed-to-seed variance. A power analysis highlights this issue. With a mean accuracy difference of Δ=0.010 and a seed standard deviation of σ=0.083, the Cohen's d effect size is a very small 0.1205. To detect this difference with standard statistical confidence (p &lt; 0.05 at 80% power) would require running 1,082 random seeds per configuration. This suggests that the small 413-image IDRiD sweep is simply underpowered, which is what led us to use the combined IDRiD+APTOS dataset.</w:t>
       </w:r>
     </w:p>
     <w:tbl>
@@ -7630,7 +7621,7 @@
         <w:jc w:val="both"/>
       </w:pPr>
       <w:r>
-        <w:t>To mitigate statistical underpowering, we executed a scaled-up federated training run using the combined 4,075-image IDRiD+APTOS training set. Table 4 outlines the results for this large-scale clinical pipeline (alpha=0.1, seed=42). We explicitly frame this as a preliminary, single-configuration result from an in-progress multi-seed sweep. Broader clinical conclusions and generalized performance assertions await the completion of the full multi-seed sweep. Nonetheless, in this initial run, federated training on this larger volume of clinical images achieves a peak global test accuracy of 55.34% (which is identical to the centralized baseline accuracy of 55.34%), showing the promise of federated learning scaling under India's DPDP Act constraints.</w:t>
+        <w:t>To address this underpowering, we ran a scaled federated trial using a combined 4,075-image IDRiD+APTOS dataset. We must emphasize that this is a preliminary, single-configuration run (α=0.1, seed=42) from an in-progress sweep; we cannot draw broad conclusions until the full multi-seed run is complete. That caveat aside, this larger trial reached a peak global accuracy of 55.34%, matching the centralized baseline. This is a promising early sign that scaling up the data volume allows federated learning to recover centralized performance levels.</w:t>
       </w:r>
     </w:p>
     <w:tbl>
@@ -7995,7 +7986,7 @@
         <w:jc w:val="both"/>
       </w:pPr>
       <w:r>
-        <w:t>During our initial sweeps, a critical anomaly was detected where the SCAFFOLD strategy produced a flat global accuracy of exactly 43.50% across all concentration parameters α. This was diagnosed as an implementation bug where: (1) BatchNorm running statistics (running mean and variance) were omitted during global-local weight exchange, retaining random initializations at evaluation; and (2) global and client control variates signature positions were swapped, applying drift corrections with the wrong sign. Redefining model weights exchange using the full state_dict and correcting the control signature resolved the issue. In our verification runs (Table 2), SCAFFOLD demonstrated improved stability at concentration parameters α=0.05, 0.3, and 1.0, achieving mean final accuracies of 48.50%, 48.83%, and 48.00% respectively. However, under α=0.1, SCAFFOLD exhibits an anomalous mean final accuracy of 23.33% (with a peak best accuracy of 47.50%), showing an unresolved anomaly that is under continued active investigation. This indicates that while the control variate bug is successfully resolved structurally, training stability under certain intermediate skews remains highly sensitive to local hyperparameters and requires further tuning.</w:t>
+        <w:t>Our initial sweeps hit a wall: SCAFFOLD remained flat at 43.50% accuracy across all α values. We traced this to two bugs in our implementation. First, the weight exchange function was omitting BatchNorm running statistics (running mean and variance), which meant the model evaluated on random initializations. Second, the signature parameters for updating the global and client control variates were swapped, applying the drift correction with the wrong sign. Fixing these bugs stabilized the algorithm. As shown in Table 2, the corrected SCAFFOLD achieved final average accuracies of 48.50% (α=0.05), 48.83% (α=0.3), and 48.00% (α=1.0). However, at α=0.1, SCAFFOLD collapsed to a final average accuracy of 23.33% (though it reached a peak of 47.50% during training). This indicates that while the structural bugs are fixed, SCAFFOLD remains highly sensitive to local hyperparameter choices under certain skew levels, an anomaly we are still investigating.</w:t>
       </w:r>
     </w:p>
     <w:p>
@@ -8019,7 +8010,7 @@
         <w:jc w:val="both"/>
       </w:pPr>
       <w:r>
-        <w:t>This empirical study systematically maps the operational boundaries of federated diabetic retinopathy grading under statistical heterogeneity, contextualized within the compliance requirements of India's DPDP Act of 2023. Our experiments verify a distinct performance phase transition: proximal regularization degrades accuracy under extreme heterogeneity but provides up to a +4.58% accuracy gain under moderate heterogeneity. Importantly, regularized federated training serves as a clinical fairness stabilizer, reducing inter-client accuracy variance and boosting the worst-performing client's accuracy by +27.69% relative to FedAvg. We also resolve the SCAFFOLD implementation bug, proving that correcting control variate updates stabilizes optimization. Finally, our power analysis reveals that small clinical cohorts are statistically underpowered, validating the necessity of a combined IDRiD+APTOS scaled-up training pipeline which successfully restores performance to centralized levels (55.34%). Future work will focus on developing adaptive regularization techniques to dynamically tune μ based on local class divergence, and validating the corrected SCAFFOLD pipeline across larger clinical networks.</w:t>
+        <w:t>This study maps out where proximal regularization helps and where it gets in the way when training federated models on skewed diabetic retinopathy datasets. The experiments show a clear phase transition: tight regularization hurts performance under severe data skew but offers a solid 4.58-point improvement under moderate skew. More importantly for clinical use, FedProx acts as a fairness stabilizer, reducing the performance gap between hospitals and boosting the worst-performing client's accuracy by up to 27.69%. We also debugged the SCAFFOLD implementation, showing that while control variates correct client drift in theory, they can be highly sensitive to hyperparameters in practice. Finally, our power analysis suggests that small clinical datasets are statistically underpowered, pointing to the necessity of larger, combined cohorts like the IDRiD+APTOS pipeline to confirm these optimization behaviors.</w:t>
       </w:r>
     </w:p>
     <w:p>

</xml_diff>